<commit_message>
Part 3 done (the branch is missing)
</commit_message>
<xml_diff>
--- a/Subnetting.docx
+++ b/Subnetting.docx
@@ -3712,7 +3712,7 @@
               <w:t> </w:t>
             </w:r>
             <w:r>
-              <w:t>N/A</w:t>
+              <w:t>10.0.1.34</w:t>
             </w:r>
           </w:p>
         </w:tc>
@@ -4235,7 +4235,7 @@
               <w:t> </w:t>
             </w:r>
             <w:r>
-              <w:t>N/A</w:t>
+              <w:t>10.0.1.42</w:t>
             </w:r>
           </w:p>
         </w:tc>
@@ -4752,7 +4752,7 @@
               <w:t> </w:t>
             </w:r>
             <w:r>
-              <w:t>N/A</w:t>
+              <w:t>10.0.1.38</w:t>
             </w:r>
           </w:p>
         </w:tc>
@@ -5266,7 +5266,7 @@
               <w:t> </w:t>
             </w:r>
             <w:r>
-              <w:t>N/A</w:t>
+              <w:t>10.0.1.46</w:t>
             </w:r>
           </w:p>
         </w:tc>
@@ -8287,10 +8287,7 @@
           </w:tcPr>
           <w:p>
             <w:r>
-              <w:t> </w:t>
-            </w:r>
-            <w:r>
-              <w:t>10.0.1.34</w:t>
+              <w:t>10.0.0.161</w:t>
             </w:r>
           </w:p>
         </w:tc>
@@ -8420,10 +8417,7 @@
           </w:tcPr>
           <w:p>
             <w:r>
-              <w:t> </w:t>
-            </w:r>
-            <w:r>
-              <w:t>10.0.1.34</w:t>
+              <w:t>10.0.0.161</w:t>
             </w:r>
           </w:p>
         </w:tc>
@@ -8553,10 +8547,7 @@
           </w:tcPr>
           <w:p>
             <w:r>
-              <w:t> </w:t>
-            </w:r>
-            <w:r>
-              <w:t>10.0.1.34</w:t>
+              <w:t>10.0.0.65</w:t>
             </w:r>
           </w:p>
         </w:tc>
@@ -8686,10 +8677,7 @@
           </w:tcPr>
           <w:p>
             <w:r>
-              <w:t>  </w:t>
-            </w:r>
-            <w:r>
-              <w:t>10.0.1.42</w:t>
+              <w:t>10.0.0.225</w:t>
             </w:r>
           </w:p>
         </w:tc>
@@ -8819,10 +8807,7 @@
           </w:tcPr>
           <w:p>
             <w:r>
-              <w:t>  </w:t>
-            </w:r>
-            <w:r>
-              <w:t>10.0.1.42</w:t>
+              <w:t>10.0.0.225</w:t>
             </w:r>
           </w:p>
         </w:tc>
@@ -8952,10 +8937,7 @@
           </w:tcPr>
           <w:p>
             <w:r>
-              <w:t>  </w:t>
-            </w:r>
-            <w:r>
-              <w:t>10.0.1.42</w:t>
+              <w:t>10.0.0.1</w:t>
             </w:r>
           </w:p>
         </w:tc>
@@ -9092,7 +9074,7 @@
           </w:tcPr>
           <w:p>
             <w:r>
-              <w:t>10.0.1.38</w:t>
+              <w:t>10.0.0.129</w:t>
             </w:r>
           </w:p>
         </w:tc>
@@ -9232,7 +9214,7 @@
           </w:tcPr>
           <w:p>
             <w:r>
-              <w:t>10.0.1.38</w:t>
+              <w:t>10.0.0.241</w:t>
             </w:r>
           </w:p>
         </w:tc>
@@ -9365,15 +9347,11 @@
               <w:bottom w:w="0" w:type="dxa"/>
               <w:right w:w="108" w:type="dxa"/>
             </w:tcMar>
-            <w:vAlign w:val="center"/>
-            <w:hideMark/>
-          </w:tcPr>
-          <w:p>
-            <w:r>
-              <w:t> </w:t>
-            </w:r>
-            <w:r>
-              <w:t>10.0.1.46</w:t>
+            <w:hideMark/>
+          </w:tcPr>
+          <w:p>
+            <w:r>
+              <w:t>10.0.0.193</w:t>
             </w:r>
           </w:p>
         </w:tc>
@@ -9508,15 +9486,11 @@
               <w:bottom w:w="0" w:type="dxa"/>
               <w:right w:w="108" w:type="dxa"/>
             </w:tcMar>
-            <w:vAlign w:val="center"/>
-            <w:hideMark/>
-          </w:tcPr>
-          <w:p>
-            <w:r>
-              <w:t> </w:t>
-            </w:r>
-            <w:r>
-              <w:t>10.0.1.46</w:t>
+            <w:hideMark/>
+          </w:tcPr>
+          <w:p>
+            <w:r>
+              <w:t>10.0.1.1</w:t>
             </w:r>
           </w:p>
         </w:tc>
@@ -11249,14 +11223,23 @@
       </w:r>
     </w:p>
     <w:p>
+      <w:pPr>
+        <w:rPr>
+          <w:highlight w:val="yellow"/>
+        </w:rPr>
+      </w:pPr>
       <w:r>
         <w:rPr>
           <w:b/>
           <w:bCs/>
+          <w:highlight w:val="yellow"/>
         </w:rPr>
         <w:t>Step 3:</w:t>
       </w:r>
       <w:r>
+        <w:rPr>
+          <w:highlight w:val="yellow"/>
+        </w:rPr>
         <w:t> Configure an 802.1Q Trunk between the Switches</w:t>
       </w:r>
     </w:p>
@@ -11265,10 +11248,14 @@
         <w:rPr>
           <w:b/>
           <w:bCs/>
+          <w:highlight w:val="yellow"/>
         </w:rPr>
         <w:t>Step 4:</w:t>
       </w:r>
       <w:r>
+        <w:rPr>
+          <w:highlight w:val="yellow"/>
+        </w:rPr>
         <w:t> Configure Inter-VLAN Routing:</w:t>
       </w:r>
     </w:p>
@@ -11381,10 +11368,14 @@
         <w:rPr>
           <w:b/>
           <w:bCs/>
+          <w:highlight w:val="yellow"/>
         </w:rPr>
         <w:t>Step 5:</w:t>
       </w:r>
       <w:r>
+        <w:rPr>
+          <w:highlight w:val="yellow"/>
+        </w:rPr>
         <w:t> Verify Inter-VLAN Routing is working</w:t>
       </w:r>
     </w:p>
@@ -11424,18 +11415,38 @@
           <w:b/>
           <w:bCs/>
         </w:rPr>
-        <w:t>             Step 7:</w:t>
+        <w:t>             </w:t>
       </w:r>
       <w:r>
+        <w:rPr>
+          <w:b/>
+          <w:bCs/>
+          <w:highlight w:val="yellow"/>
+        </w:rPr>
+        <w:t>Step 7:</w:t>
+      </w:r>
+      <w:r>
+        <w:rPr>
+          <w:highlight w:val="yellow"/>
+        </w:rPr>
         <w:t xml:space="preserve"> Verify </w:t>
       </w:r>
       <w:proofErr w:type="spellStart"/>
       <w:r>
+        <w:rPr>
+          <w:highlight w:val="yellow"/>
+        </w:rPr>
         <w:t>EtherChannels</w:t>
       </w:r>
       <w:proofErr w:type="spellEnd"/>
       <w:r>
-        <w:t xml:space="preserve"> are working. </w:t>
+        <w:rPr>
+          <w:highlight w:val="yellow"/>
+        </w:rPr>
+        <w:t xml:space="preserve"> are working.</w:t>
+      </w:r>
+      <w:r>
+        <w:t> </w:t>
       </w:r>
     </w:p>
     <w:p/>

</xml_diff>